<commit_message>
HP submission: reviewer audit, remove old-version framing, hard-code-free numbers, aligned intro/discussion
Co-Authored-By: Tatsuki Onishi <bougtoir@gmail.com>
</commit_message>
<xml_diff>
--- a/medical_accident_its_analysis/manuscript/hp_cover_letter.docx
+++ b/medical_accident_its_analysis/manuscript/hp_cover_letter.docx
@@ -49,7 +49,7 @@
           <w:rFonts w:ascii="Times New Roman" w:hAnsi="Times New Roman"/>
           <w:sz w:val="22"/>
         </w:rPr>
-        <w:t>We submit an original full-length article, "Litigation risk and specialty-level physician workforce in Japan, 2008–2024: a rate-based re-analysis with equivalence testing", for consideration by Health Policy.</w:t>
+        <w:t>We submit an original full-length article, "Litigation risk and specialty-level physician workforce in Japan, 2008–2024: a rate-based analysis with equivalence testing", for consideration by Health Policy.</w:t>
       </w:r>
     </w:p>
     <w:p>
@@ -73,7 +73,7 @@
           <w:rFonts w:ascii="Times New Roman" w:hAnsi="Times New Roman"/>
           <w:sz w:val="22"/>
         </w:rPr>
-        <w:t>Crucially, we express exposure as a rate (closed claims per 1,000 physicians) to remove specialty-size confounding, analyse only measured biennial physician observations rather than interpolated annual values, and apply equivalence (TOST) testing. We find no association between litigation risk and workforce or hospital change; the effect is statistically equivalent to a null within a small, pre-specified margin. The common intuition that physicians avoid high-litigation specialties is not supported. We show that previously reported associations arise from size confounding and from treating interpolated years as independent observations, and we discuss how structural incentives—no-fault obstetric compensation (JOCS-CP) and procedure-based reimbursement—may sustain the specialty workforce.</w:t>
+        <w:t>Crucially, we express exposure as a rate (closed claims per 1,000 physicians) to remove specialty-size confounding, analyse only measured biennial physician observations rather than interpolated annual values, and apply equivalence (TOST) testing. We find no association between litigation risk and workforce or hospital change; the effect is statistically equivalent to a null within a small, pre-specified margin. The common intuition that physicians avoid high-litigation specialties is not supported. We show that count-based associations can arise from size confounding and from treating interpolated years as independent observations, and we discuss how structural incentives—notably no-fault obstetric compensation (JOCS-CP)—may sustain the specialty workforce.</w:t>
       </w:r>
     </w:p>
     <w:p>
@@ -85,7 +85,7 @@
           <w:rFonts w:ascii="Times New Roman" w:hAnsi="Times New Roman"/>
           <w:sz w:val="22"/>
         </w:rPr>
-        <w:t>This manuscript is a substantially rebuilt analysis prepared after external peer review of an earlier version identified count-based modelling and interpolation as structural problems; we have addressed these by moving to rates, measured-only data, equivalence testing, explicit treatment of JOCS-CP, and correction of the Medical Accident Investigation System description. All data and code are openly available and every reported number is reproducible from raw files.</w:t>
+        <w:t>All data and code are openly available and every reported number is reproducible from the raw primary files in the accompanying repository.</w:t>
       </w:r>
     </w:p>
     <w:p>

</xml_diff>